<commit_message>
Supprime les pages blanches autour du sommaire
Template : retrait du titre 4 vide et du saut de page manuel entre la page
de garde et le sommaire. Le saut de section de la page de garde ouvre déjà
une page, et le style du titre du sommaire en impose une autre.

config.yaml : la partie Initialisation ne pose plus de saut de page en
plus de celui du style Titre 1, comme les autres parties de niveau 1.

Co-Authored-By: Claude Opus 5.5 <noreply@anthropic.com>
Claude-Session: https://claude.ai/code/session_016ZrHa2LcyNv6KcZ9gP5J6j
</commit_message>
<xml_diff>
--- a/template-doc-pbib.docx
+++ b/template-doc-pbib.docx
@@ -50,29 +50,6 @@
       </w:r>
       <w:r>
         <w:t xml:space="preserve"> du document</w:t>
-      </w:r>
-    </w:p>
-    <w:p>
-      <w:pPr>
-        <w:pStyle w:val="Titre4"/>
-        <w:numPr>
-          <w:ilvl w:val="0"/>
-          <w:numId w:val="0"/>
-        </w:numPr>
-      </w:pPr>
-    </w:p>
-    <w:p>
-      <w:pPr>
-        <w:suppressAutoHyphens w:val="0"/>
-        <w:spacing w:after="160" w:line="256" w:lineRule="auto"/>
-        <w:rPr>
-          <w:rFonts w:eastAsia="MS Gothic" w:cs="Times New Roman"/>
-          <w:b/>
-          <w:iCs/>
-        </w:rPr>
-      </w:pPr>
-      <w:r>
-        <w:br w:type="page"/>
       </w:r>
     </w:p>
     <w:bookmarkStart w:id="0" w:name="_Toc236228647" w:displacedByCustomXml="next"/>

</xml_diff>